<commit_message>
Version 0.1.0b1: the first public build, a beta
The README, the manual and INSTALL.md say where the ready-made
application is (the Releases page), which file is for which system and
how to get past an unsigned app's first-launch warning.  The Linux
bundle carries install.sh, which installs for the user alone and
uninstalls again.  A beta tag is filed as a pre-release.

Fixed on the way: the Mac app declared macOS 11 though its Qt needs 13,
and is given its version as numbers only (0.1.0b1 is not one macOS
takes); the Linux bundle is built on Ubuntu 24.04 rather than on
ubuntu-latest, as it runs only on a C library at least as new; the
About box and the manual read the program's version, and a test checks
that every file naming it agrees.

Co-Authored-By: Claude Opus 5.5 <noreply@anthropic.com>
</commit_message>
<xml_diff>
--- a/docs/BIRDS_User_Manual.docx
+++ b/docs/BIRDS_User_Manual.docx
@@ -64,7 +64,7 @@
           <w:color w:val="5B6478"/>
           <w:sz w:val="28"/>
         </w:rPr>
-        <w:t>Broad Igneous Rocks — Diagrams &amp; Statistics · Version 0.1.0</w:t>
+        <w:t>Broad Igneous Rocks — Diagrams &amp; Statistics · Version 0.1.0b1</w:t>
       </w:r>
     </w:p>
     <w:p/>
@@ -163,7 +163,7 @@
     </w:p>
     <w:p>
       <w:r>
-        <w:t>If you use B.I.R.D.S in a publication, please cite the underlying references printed in each plot's subtitle, plus the software itself: Torres Sánchez, D. (2026). B.I.R.D.S — Broad Igneous Rocks: Diagrams &amp; Statistics (v0.1.0).</w:t>
+        <w:t>If you use B.I.R.D.S in a publication, please cite the underlying references printed in each plot's subtitle, plus the software itself: Torres Sánchez, D. (2026). B.I.R.D.S — Broad Igneous Rocks: Diagrams &amp; Statistics (v0.1.0b1).</w:t>
       </w:r>
     </w:p>
     <w:p/>
@@ -184,7 +184,7 @@
         <w:spacing w:after="40"/>
       </w:pPr>
       <w:r>
-        <w:t>Operating system: Windows 10 or later, macOS 11 (Big Sur) or later, or any modern Linux distribution.</w:t>
+        <w:t>Operating system, to run from the source: Windows 10 or later, macOS 11 (Big Sur) or later, or any modern Linux distribution. The ready-made application needs a little more; see below.</w:t>
       </w:r>
     </w:p>
     <w:p>
@@ -230,6 +230,49 @@
       </w:pPr>
       <w:r>
         <w:t>Installed as an application — BIRDS.app on macOS, or through the Windows installer — B.I.R.D.S needs no Python at all, and about 400 MB of disk.</w:t>
+      </w:r>
+    </w:p>
+    <w:p>
+      <w:pPr>
+        <w:pStyle w:val="Heading2"/>
+      </w:pPr>
+      <w:r>
+        <w:rPr>
+          <w:color w:val="1F3A93"/>
+        </w:rPr>
+        <w:t>The ready-made application</w:t>
+      </w:r>
+    </w:p>
+    <w:p>
+      <w:r>
+        <w:t>Each release puts the application, ready to run, on the Releases page: https://github.com/DarioTorresSanchez/BIRDS/releases — under Assets, the file for your system. It needs:</w:t>
+      </w:r>
+    </w:p>
+    <w:p>
+      <w:pPr>
+        <w:pStyle w:val="ListBullet"/>
+        <w:spacing w:after="40"/>
+      </w:pPr>
+      <w:r>
+        <w:t>Windows: Windows 10 or 11, 64-bit — BIRDS-&lt;version&gt;-setup.exe (section 3.5).</w:t>
+      </w:r>
+    </w:p>
+    <w:p>
+      <w:pPr>
+        <w:pStyle w:val="ListBullet"/>
+        <w:spacing w:after="40"/>
+      </w:pPr>
+      <w:r>
+        <w:t>macOS: macOS 13 (Ventura) or later on an Apple-silicon Mac (M1 or newer) — BIRDS-&lt;version&gt;-macOS-arm64.zip (section 4.5). On an Intel Mac, run it from the source.</w:t>
+      </w:r>
+    </w:p>
+    <w:p>
+      <w:pPr>
+        <w:pStyle w:val="ListBullet"/>
+        <w:spacing w:after="40"/>
+      </w:pPr>
+      <w:r>
+        <w:t>Linux: x86-64, Ubuntu 24.04, Debian 13, Fedora 40 or newer, or a distribution based on one of them — BIRDS-&lt;version&gt;-linux-x86_64.tar.gz. Unpack it and run BIRDS-linux/install.sh: it installs for your user only, with no administrator password, adds B.I.R.D.S to the applications menu and makes .birds files open with a double-click. BIRDS-linux/install.sh --uninstall removes it.</w:t>
       </w:r>
     </w:p>
     <w:p/>
@@ -460,7 +503,24 @@
     </w:p>
     <w:p>
       <w:r>
-        <w:t>B.I.R.D.S can also be packaged as a Windows installer. The installed program needs no Python, has a Start-menu entry, and registers .birds sessions: they carry the session icon and open with a double-click. The installer is built on a Windows computer from the source, with PyInstaller and Inno Setup 6, following packaging/README.md; check the built program with BIRDS.exe --self-test before sharing it.</w:t>
+        <w:t>Instead of sections 3.1–3.4, B.I.R.D.S can be installed as a program of its own. Download BIRDS-&lt;version&gt;-setup.exe from the Releases page (section 2) and run it. The installed program needs no Python, has a Start-menu entry, and registers .birds sessions: they carry the session icon and open with a double-click.</w:t>
+      </w:r>
+    </w:p>
+    <w:p>
+      <w:r>
+        <w:rPr>
+          <w:b/>
+          <w:color w:val="B13A3A"/>
+        </w:rPr>
+        <w:t xml:space="preserve">Note. </w:t>
+      </w:r>
+      <w:r>
+        <w:t>The installer is not signed with a paid code-signing certificate, so the first time Windows shows “Windows protected your PC”. Click More info, then Run anyway.</w:t>
+      </w:r>
+    </w:p>
+    <w:p>
+      <w:r>
+        <w:t>The installer is built from the source with PyInstaller and Inno Setup 6, following packaging/README.md; check a build of your own with BIRDS.exe --self-test before sharing it.</w:t>
       </w:r>
     </w:p>
     <w:p/>
@@ -664,7 +724,16 @@
         <w:spacing w:after="40"/>
       </w:pPr>
       <w:r>
-        <w:t>If you received BIRDS.app: drag it into Applications. The first time, right-click it and choose Open, then Open again — the app is not signed with an Apple developer certificate, so macOS asks once. After that it opens normally.</w:t>
+        <w:t>Download BIRDS-&lt;version&gt;-macOS-arm64.zip from the Releases page (section 2), open it, and drag BIRDS into Applications. It needs macOS 13 or later on an Apple-silicon Mac.</w:t>
+      </w:r>
+    </w:p>
+    <w:p>
+      <w:pPr>
+        <w:pStyle w:val="ListBullet"/>
+        <w:spacing w:after="40"/>
+      </w:pPr>
+      <w:r>
+        <w:t>The first time, macOS says it could not verify the app — it is not signed with a paid Apple developer certificate. Click Done, open System Settings → Privacy &amp; Security, scroll down to the message about BIRDS and click Open Anyway. After that it opens normally.</w:t>
       </w:r>
     </w:p>
     <w:p>

</xml_diff>

<commit_message>
Version 0.1.0b2: the second beta
What was found after the first beta was published: control panels cut
off on Windows, diagram names losing their "&" in the menus, titles
showing their mathtext, the Petrography panel clipped, the licence not
recognised -- and the README's screenshots.

Co-Authored-By: Claude Opus 5.5 <noreply@anthropic.com>
</commit_message>
<xml_diff>
--- a/docs/BIRDS_User_Manual.docx
+++ b/docs/BIRDS_User_Manual.docx
@@ -64,7 +64,7 @@
           <w:color w:val="5B6478"/>
           <w:sz w:val="28"/>
         </w:rPr>
-        <w:t>Broad Igneous Rocks — Diagrams &amp; Statistics · Version 0.1.0b1</w:t>
+        <w:t>Broad Igneous Rocks — Diagrams &amp; Statistics · Version 0.1.0b2</w:t>
       </w:r>
     </w:p>
     <w:p/>
@@ -163,7 +163,7 @@
     </w:p>
     <w:p>
       <w:r>
-        <w:t>If you use B.I.R.D.S in a publication, please cite the underlying references printed in each plot's subtitle, plus the software itself: Torres Sánchez, D. (2026). B.I.R.D.S — Broad Igneous Rocks: Diagrams &amp; Statistics (v0.1.0b1).</w:t>
+        <w:t>If you use B.I.R.D.S in a publication, please cite the underlying references printed in each plot's subtitle, plus the software itself: Torres Sánchez, D. (2026). B.I.R.D.S — Broad Igneous Rocks: Diagrams &amp; Statistics (v0.1.0b2).</w:t>
       </w:r>
     </w:p>
     <w:p/>

</xml_diff>

<commit_message>
Version 0.1.0b3: the third beta, replacing the first two
The installed application exports PDF, SVG and EPS again -- the first
two betas could export only PNG and JPEG, and are withdrawn -- and the
groups' shaded hulls are drawn on every diagram.

Co-Authored-By: Claude Opus 5.5 <noreply@anthropic.com>
</commit_message>
<xml_diff>
--- a/docs/BIRDS_User_Manual.docx
+++ b/docs/BIRDS_User_Manual.docx
@@ -64,7 +64,7 @@
           <w:color w:val="5B6478"/>
           <w:sz w:val="28"/>
         </w:rPr>
-        <w:t>Broad Igneous Rocks — Diagrams &amp; Statistics · Version 0.1.0b2</w:t>
+        <w:t>Broad Igneous Rocks — Diagrams &amp; Statistics · Version 0.1.0b3</w:t>
       </w:r>
     </w:p>
     <w:p/>
@@ -163,7 +163,7 @@
     </w:p>
     <w:p>
       <w:r>
-        <w:t>If you use B.I.R.D.S in a publication, please cite the underlying references printed in each plot's subtitle, plus the software itself: Torres Sánchez, D. (2026). B.I.R.D.S — Broad Igneous Rocks: Diagrams &amp; Statistics (v0.1.0b2).</w:t>
+        <w:t>If you use B.I.R.D.S in a publication, please cite the underlying references printed in each plot's subtitle, plus the software itself: Torres Sánchez, D. (2026). B.I.R.D.S — Broad Igneous Rocks: Diagrams &amp; Statistics (v0.1.0b3).</w:t>
       </w:r>
     </w:p>
     <w:p/>

</xml_diff>

<commit_message>
Group symbol sizes, anomalies on Bivariate axes, template without units row
Requested by Darío.

- Edit plot: a Size per group (Auto follows the Point size), kept by
  sessions and presets; every diagram, Bivariate, Isotopes, the spider
  patterns and the map (in proportion to its own Size) draw it.  The
  Isotopes plots now go through draw_group, so Hull and Sym work there.
- Bivariate, Individual and Paired: the anomalies Statistics reports
  (Eu/Eu*, Nb/Nb*, (La/Yb)N...) as axes, with its values -- same
  function, adjusted switch and chondrite, which redraws the plot when
  changed.  Nothing is written into the dataset.
- Template: no row of units under the column names; units stay in the
  Reference sheet.  A file filled in with the old template imported its
  units row as a sample and, with few samples, turned the numbers to
  text; the importer now drops a first row holding units only.

Co-Authored-By: Claude Opus 5.5 <noreply@anthropic.com>
</commit_message>
<xml_diff>
--- a/docs/BIRDS_User_Manual.docx
+++ b/docs/BIRDS_User_Manual.docx
@@ -1029,6 +1029,11 @@
       </w:r>
     </w:p>
     <w:p>
+      <w:r>
+        <w:t>Each sheet has the column names in row 1 and your samples from row 2 down. The unit of every column — wt % for the oxides, ppm for the trace elements — is in the Reference sheet. Templates before version 0.1.0b3 had a row of units under the names; a file filled in with one still imports, as that row is recognised and skipped.</w:t>
+      </w:r>
+    </w:p>
+    <w:p>
       <w:pPr>
         <w:pStyle w:val="Heading2"/>
       </w:pPr>
@@ -1120,6 +1125,24 @@
       </w:pPr>
       <w:r>
         <w:t>B.I.R.D.S auto-fills the group names from the unique values in those columns — up to 25 groups, each with its own colour and no two with the same colour and symbol. You can edit each name, colour and symbol. With many groups, set the legend to Outside so it does not cover the plot.</w:t>
+      </w:r>
+    </w:p>
+    <w:p>
+      <w:pPr>
+        <w:pStyle w:val="ListBullet"/>
+        <w:spacing w:after="40"/>
+      </w:pPr>
+      <w:r>
+        <w:t>Size sets a group's own symbol size, in points, to make it stand out from the rest; Auto follows the Point size at the top of the dialog. The map draws it in proportion to its own Size control.</w:t>
+      </w:r>
+    </w:p>
+    <w:p>
+      <w:pPr>
+        <w:pStyle w:val="ListBullet"/>
+        <w:spacing w:after="40"/>
+      </w:pPr>
+      <w:r>
+        <w:t>Hull shades the convex hull of the group's samples on every diagram; untick Sym to keep only the shading.</w:t>
       </w:r>
     </w:p>
     <w:p>
@@ -1544,6 +1567,22 @@
     <w:p>
       <w:r>
         <w:t>They are the same definitions as the statistics table uses, and they can be used inside an expression too, such as Mg#_FeOt/100. A column of your own named Mg# takes precedence over the computed one.</w:t>
+      </w:r>
+    </w:p>
+    <w:p>
+      <w:pPr>
+        <w:pStyle w:val="Heading2"/>
+      </w:pPr>
+      <w:r>
+        <w:rPr>
+          <w:color w:val="1F3A93"/>
+        </w:rPr>
+        <w:t>Anomalies</w:t>
+      </w:r>
+    </w:p>
+    <w:p>
+      <w:r>
+        <w:t>After the elements, in purple, come the anomalies the Statistics view reports — Eu/Eu*, Ce/Ce*, Nb/Nb*, Ti/Ti*, (La/Yb)N and the rest — in Individual and in Paired alike. They are worked out sample by sample, from the majors the adjusted switch selects, against the chondrite chosen in Statistics and in the data table, so a value on an axis is the value those views show; changing the chondrite there redraws the plot. Nothing is added to your dataset, and a column of your own with the same name takes precedence. Hover over an anomaly for its definition.</w:t>
       </w:r>
     </w:p>
     <w:p>

</xml_diff>

<commit_message>
Version 0.1.0b4: the fourth beta
A symbol size for each group, the anomalies as Bivariate axes, and a
data-entry template without a row of units.  The manual said templates
before 0.1.0b3 had the units row; 0.1.0b3 had it too.

Co-Authored-By: Claude Opus 5.5 <noreply@anthropic.com>
</commit_message>
<xml_diff>
--- a/docs/BIRDS_User_Manual.docx
+++ b/docs/BIRDS_User_Manual.docx
@@ -64,7 +64,7 @@
           <w:color w:val="5B6478"/>
           <w:sz w:val="28"/>
         </w:rPr>
-        <w:t>Broad Igneous Rocks — Diagrams &amp; Statistics · Version 0.1.0b3</w:t>
+        <w:t>Broad Igneous Rocks — Diagrams &amp; Statistics · Version 0.1.0b4</w:t>
       </w:r>
     </w:p>
     <w:p/>
@@ -163,7 +163,7 @@
     </w:p>
     <w:p>
       <w:r>
-        <w:t>If you use B.I.R.D.S in a publication, please cite the underlying references printed in each plot's subtitle, plus the software itself: Torres Sánchez, D. (2026). B.I.R.D.S — Broad Igneous Rocks: Diagrams &amp; Statistics (v0.1.0b3).</w:t>
+        <w:t>If you use B.I.R.D.S in a publication, please cite the underlying references printed in each plot's subtitle, plus the software itself: Torres Sánchez, D. (2026). B.I.R.D.S — Broad Igneous Rocks: Diagrams &amp; Statistics (v0.1.0b4).</w:t>
       </w:r>
     </w:p>
     <w:p/>
@@ -1030,7 +1030,7 @@
     </w:p>
     <w:p>
       <w:r>
-        <w:t>Each sheet has the column names in row 1 and your samples from row 2 down. The unit of every column — wt % for the oxides, ppm for the trace elements — is in the Reference sheet. Templates before version 0.1.0b3 had a row of units under the names; a file filled in with one still imports, as that row is recognised and skipped.</w:t>
+        <w:t>Each sheet has the column names in row 1 and your samples from row 2 down. The unit of every column — wt % for the oxides, ppm for the trace elements — is in the Reference sheet. Templates up to version 0.1.0b3 had a row of units under the names; a file filled in with one still imports, as that row is recognised and skipped.</w:t>
       </w:r>
     </w:p>
     <w:p>

</xml_diff>